<commit_message>
Correct finalizer declaration in slides and learner guide
</commit_message>
<xml_diff>
--- a/courseware/LG-AI Vibe Coding with C#.docx
+++ b/courseware/LG-AI Vibe Coding with C#.docx
@@ -6296,19 +6296,19 @@
           <w:rFonts w:ascii="Consolas" w:hAnsi="Consolas"/>
           <w:sz w:val="18"/>
         </w:rPr>
-        <w:t xml:space="preserve">// </w:t>
-      </w:r>
-    </w:p>
-    <w:p>
-      <w:pPr>
-        <w:spacing w:after="0"/>
-      </w:pPr>
-      <w:r>
-        <w:rPr>
-          <w:rFonts w:ascii="Consolas" w:hAnsi="Consolas"/>
-          <w:sz w:val="18"/>
-        </w:rPr>
-        <w:t>Type() is a nondeterministic finalizer.</w:t>
+        <w:t>// Finalizer declaration: ~Type()</w:t>
+      </w:r>
+    </w:p>
+    <w:p>
+      <w:pPr>
+        <w:spacing w:after="0"/>
+      </w:pPr>
+      <w:r>
+        <w:rPr>
+          <w:rFonts w:ascii="Consolas" w:hAnsi="Consolas"/>
+          <w:sz w:val="18"/>
+        </w:rPr>
+        <w:t>// Execution timing is nondeterministic.</w:t>
       </w:r>
     </w:p>
     <w:p>

</xml_diff>